<commit_message>
Refactor operator UI and field workflows
</commit_message>
<xml_diff>
--- a/tz_updated.docx
+++ b/tz_updated.docx
@@ -1910,7 +1910,340 @@
         <w:pStyle w:val="Heading1"/>
       </w:pPr>
       <w:r>
-        <w:t>21. Используемые инструменты и обоснование выбора</w:t>
+        <w:t>21. Основные страницы системы, права доступа и используемые модули</w:t>
+      </w:r>
+    </w:p>
+    <w:p>
+      <w:r>
+        <w:t>Ниже приведен перечень основных страниц и разделов системы с указанием их назначения, используемых функциональных модулей и ролей, которым должен предоставляться доступ.</w:t>
+      </w:r>
+    </w:p>
+    <w:p>
+      <w:pPr>
+        <w:pStyle w:val="Heading2"/>
+      </w:pPr>
+      <w:r>
+        <w:t>21.1. Страница входа в систему</w:t>
+      </w:r>
+    </w:p>
+    <w:p>
+      <w:pPr>
+        <w:pStyle w:val="ListBullet"/>
+      </w:pPr>
+      <w:r>
+        <w:t>Назначение: авторизация пользователя и определение набора доступных разделов по роли.</w:t>
+      </w:r>
+    </w:p>
+    <w:p>
+      <w:pPr>
+        <w:pStyle w:val="ListBullet"/>
+      </w:pPr>
+      <w:r>
+        <w:t>Используемые модули: модуль аутентификации, модуль ролевой модели, модуль валидации учетных данных.</w:t>
+      </w:r>
+    </w:p>
+    <w:p>
+      <w:pPr>
+        <w:pStyle w:val="ListBullet"/>
+      </w:pPr>
+      <w:r>
+        <w:t>Роли доступа: все пользователи системы.</w:t>
+      </w:r>
+    </w:p>
+    <w:p>
+      <w:pPr>
+        <w:pStyle w:val="Heading2"/>
+      </w:pPr>
+      <w:r>
+        <w:t>21.2. Личный кабинет пользователя</w:t>
+      </w:r>
+    </w:p>
+    <w:p>
+      <w:pPr>
+        <w:pStyle w:val="ListBullet"/>
+      </w:pPr>
+      <w:r>
+        <w:t>Назначение: просмотр и редактирование персональных данных, аватара, контактов и текущей роли.</w:t>
+      </w:r>
+    </w:p>
+    <w:p>
+      <w:pPr>
+        <w:pStyle w:val="ListBullet"/>
+      </w:pPr>
+      <w:r>
+        <w:t>Используемые модули: модуль профиля пользователя, модуль загрузки фото, модуль ролевых прав, модуль личной статистики.</w:t>
+      </w:r>
+    </w:p>
+    <w:p>
+      <w:pPr>
+        <w:pStyle w:val="ListBullet"/>
+      </w:pPr>
+      <w:r>
+        <w:t>Роли доступа: оператор, диспетчер, супервайзер.</w:t>
+      </w:r>
+    </w:p>
+    <w:p>
+      <w:pPr>
+        <w:pStyle w:val="Heading2"/>
+      </w:pPr>
+      <w:r>
+        <w:t>21.3. Мобильная страница 'Мои назначения'</w:t>
+      </w:r>
+    </w:p>
+    <w:p>
+      <w:pPr>
+        <w:pStyle w:val="ListBullet"/>
+      </w:pPr>
+      <w:r>
+        <w:t>Назначение: работа полевого сотрудника с назначенными помещениями и оборудованием.</w:t>
+      </w:r>
+    </w:p>
+    <w:p>
+      <w:pPr>
+        <w:pStyle w:val="ListBullet"/>
+      </w:pPr>
+      <w:r>
+        <w:t>Используемые модули: модуль назначений, модуль проверки помещений, модуль поэкземплярного учета, модуль повторной проверки, модуль офлайн-хранилища, модуль синхронизации.</w:t>
+      </w:r>
+    </w:p>
+    <w:p>
+      <w:pPr>
+        <w:pStyle w:val="ListBullet"/>
+      </w:pPr>
+      <w:r>
+        <w:t>Роли доступа: оператор.</w:t>
+      </w:r>
+    </w:p>
+    <w:p>
+      <w:pPr>
+        <w:pStyle w:val="Heading2"/>
+      </w:pPr>
+      <w:r>
+        <w:t>21.4. Операторская панель: страница 'Контроль'</w:t>
+      </w:r>
+    </w:p>
+    <w:p>
+      <w:pPr>
+        <w:pStyle w:val="ListBullet"/>
+      </w:pPr>
+      <w:r>
+        <w:t>Назначение: общий мониторинг хода работ, состояния помещений и проблемных экземпляров.</w:t>
+      </w:r>
+    </w:p>
+    <w:p>
+      <w:pPr>
+        <w:pStyle w:val="ListBullet"/>
+      </w:pPr>
+      <w:r>
+        <w:t>Используемые модули: модуль версий плана, модуль аналитики, модуль контроля помещений, модуль контроля экземпляров, модуль графиков, модуль фильтрации и поиска.</w:t>
+      </w:r>
+    </w:p>
+    <w:p>
+      <w:pPr>
+        <w:pStyle w:val="ListBullet"/>
+      </w:pPr>
+      <w:r>
+        <w:t>Роли доступа: диспетчер, супервайзер.</w:t>
+      </w:r>
+    </w:p>
+    <w:p>
+      <w:pPr>
+        <w:pStyle w:val="Heading2"/>
+      </w:pPr>
+      <w:r>
+        <w:t>21.5. Операторская панель: страница 'Сотрудники'</w:t>
+      </w:r>
+    </w:p>
+    <w:p>
+      <w:pPr>
+        <w:pStyle w:val="ListBullet"/>
+      </w:pPr>
+      <w:r>
+        <w:t>Назначение: создание, редактирование, отключение и восстановление сотрудников, назначение ролей, загрузка фотографий.</w:t>
+      </w:r>
+    </w:p>
+    <w:p>
+      <w:pPr>
+        <w:pStyle w:val="ListBullet"/>
+      </w:pPr>
+      <w:r>
+        <w:t>Используемые модули: модуль пользователей, модуль ролей, модуль валидации данных сотрудника, модуль загрузки фото.</w:t>
+      </w:r>
+    </w:p>
+    <w:p>
+      <w:pPr>
+        <w:pStyle w:val="ListBullet"/>
+      </w:pPr>
+      <w:r>
+        <w:t>Роли доступа: супервайзер.</w:t>
+      </w:r>
+    </w:p>
+    <w:p>
+      <w:pPr>
+        <w:pStyle w:val="Heading2"/>
+      </w:pPr>
+      <w:r>
+        <w:t>21.6. Операторская панель: страница 'Назначения'</w:t>
+      </w:r>
+    </w:p>
+    <w:p>
+      <w:pPr>
+        <w:pStyle w:val="ListBullet"/>
+      </w:pPr>
+      <w:r>
+        <w:t>Назначение: распределение этажей, отделений и помещений между сотрудниками, контроль прогресса по назначенным зонам.</w:t>
+      </w:r>
+    </w:p>
+    <w:p>
+      <w:pPr>
+        <w:pStyle w:val="ListBullet"/>
+      </w:pPr>
+      <w:r>
+        <w:t>Используемые модули: модуль назначений, модуль дерева помещений, модуль группировки сотрудников, модуль повторной проверки, модуль контроля пересечений назначений.</w:t>
+      </w:r>
+    </w:p>
+    <w:p>
+      <w:pPr>
+        <w:pStyle w:val="ListBullet"/>
+      </w:pPr>
+      <w:r>
+        <w:t>Роли доступа: диспетчер, супервайзер.</w:t>
+      </w:r>
+    </w:p>
+    <w:p>
+      <w:pPr>
+        <w:pStyle w:val="Heading2"/>
+      </w:pPr>
+      <w:r>
+        <w:t>21.7. Операторская панель: страница 'Группы'</w:t>
+      </w:r>
+    </w:p>
+    <w:p>
+      <w:pPr>
+        <w:pStyle w:val="ListBullet"/>
+      </w:pPr>
+      <w:r>
+        <w:t>Назначение: объединение сотрудников в группы и контроль общего прогресса группы.</w:t>
+      </w:r>
+    </w:p>
+    <w:p>
+      <w:pPr>
+        <w:pStyle w:val="ListBullet"/>
+      </w:pPr>
+      <w:r>
+        <w:t>Используемые модули: модуль групп сотрудников, модуль общих назначений, модуль агрегированного прогресса.</w:t>
+      </w:r>
+    </w:p>
+    <w:p>
+      <w:pPr>
+        <w:pStyle w:val="ListBullet"/>
+      </w:pPr>
+      <w:r>
+        <w:t>Роли доступа: диспетчер, супервайзер.</w:t>
+      </w:r>
+    </w:p>
+    <w:p>
+      <w:pPr>
+        <w:pStyle w:val="Heading2"/>
+      </w:pPr>
+      <w:r>
+        <w:t>21.8. Операторская панель: страница 'Экспорт'</w:t>
+      </w:r>
+    </w:p>
+    <w:p>
+      <w:pPr>
+        <w:pStyle w:val="ListBullet"/>
+      </w:pPr>
+      <w:r>
+        <w:t>Назначение: просмотр табличного представления итоговых данных и подготовка к выгрузке в Excel.</w:t>
+      </w:r>
+    </w:p>
+    <w:p>
+      <w:pPr>
+        <w:pStyle w:val="ListBullet"/>
+      </w:pPr>
+      <w:r>
+        <w:t>Используемые модули: модуль отчетности, модуль экспорта Excel, модуль фильтрации, модуль табличного представления экземпляров.</w:t>
+      </w:r>
+    </w:p>
+    <w:p>
+      <w:pPr>
+        <w:pStyle w:val="ListBullet"/>
+      </w:pPr>
+      <w:r>
+        <w:t>Роли доступа: диспетчер, супервайзер.</w:t>
+      </w:r>
+    </w:p>
+    <w:p>
+      <w:pPr>
+        <w:pStyle w:val="Heading2"/>
+      </w:pPr>
+      <w:r>
+        <w:t>21.9. Складские страницы и операции</w:t>
+      </w:r>
+    </w:p>
+    <w:p>
+      <w:pPr>
+        <w:pStyle w:val="ListBullet"/>
+      </w:pPr>
+      <w:r>
+        <w:t>Назначение: работа с поступлениями, складскими зонами, подтверждениями приемки и перемещениями оборудования.</w:t>
+      </w:r>
+    </w:p>
+    <w:p>
+      <w:pPr>
+        <w:pStyle w:val="ListBullet"/>
+      </w:pPr>
+      <w:r>
+        <w:t>Используемые модули: модуль складов, модуль поступлений, модуль подтверждений приемки, модуль перемещений, модуль остатков.</w:t>
+      </w:r>
+    </w:p>
+    <w:p>
+      <w:pPr>
+        <w:pStyle w:val="ListBullet"/>
+      </w:pPr>
+      <w:r>
+        <w:t>Роли доступа: диспетчер, супервайзер. Для подтверждения приемки отдельные операции доступны оператору в полевом интерфейсе.</w:t>
+      </w:r>
+    </w:p>
+    <w:p>
+      <w:pPr>
+        <w:pStyle w:val="Heading2"/>
+      </w:pPr>
+      <w:r>
+        <w:t>21.10. Журналы и конфликты</w:t>
+      </w:r>
+    </w:p>
+    <w:p>
+      <w:pPr>
+        <w:pStyle w:val="ListBullet"/>
+      </w:pPr>
+      <w:r>
+        <w:t>Назначение: просмотр истории действий, расхождений, конфликтов и результатов повторных проверок.</w:t>
+      </w:r>
+    </w:p>
+    <w:p>
+      <w:pPr>
+        <w:pStyle w:val="ListBullet"/>
+      </w:pPr>
+      <w:r>
+        <w:t>Используемые модули: модуль событий, модуль аудита, модуль конфликтов, модуль повторных проверок.</w:t>
+      </w:r>
+    </w:p>
+    <w:p>
+      <w:pPr>
+        <w:pStyle w:val="ListBullet"/>
+      </w:pPr>
+      <w:r>
+        <w:t>Роли доступа: диспетчер, супервайзер.</w:t>
+      </w:r>
+    </w:p>
+    <w:p>
+      <w:pPr>
+        <w:pStyle w:val="Heading1"/>
+      </w:pPr>
+      <w:r>
+        <w:t>22. Используемые инструменты и обоснование выбора</w:t>
       </w:r>
     </w:p>
     <w:p>

</xml_diff>